<commit_message>
Workspace completeness & polish pass
- Workspaces now UPSERT (icon/colour/content/child blocks re-applied every
  migrate) - fixes the skip-if-exists bug that blocked icon updates
- Full doctype->workspace placement: all 18 custom parents have exactly one
  home shortcut; masters referenced via link cards; no orphans
- All 14 reports linked on owning workspace (+ new Weekly Section MIS)
- Intro paragraph on all 6 workspaces; Module Onboarding + steps on the 5
  operational workspaces
- Plain-language field descriptions on the hand-filled fields (Gate Entry,
  Daily Progress Log + child tables, permits, gate pass, safety/visitor)
- Icons validated against Frappe Lucide set; colours per spec
- audit.py extended: asserts placement, report links, icons, intro/onboarding

Co-Authored-By: Claude Opus 4.8 <noreply@anthropic.com>
</commit_message>
<xml_diff>
--- a/docs/Benkas_ERP_System_Documentation.docx
+++ b/docs/Benkas_ERP_System_Documentation.docx
@@ -34,7 +34,7 @@
         <w:rPr>
           <w:sz w:val="20"/>
         </w:rPr>
-        <w:t>Custom app on ERPNext v16 + HRMS  |  Ramshy Bio Pvt. Ltd.  |  Generated 06 Jul 2026 16:24</w:t>
+        <w:t>Custom app on ERPNext v16 + HRMS  |  Ramshy Bio Pvt. Ltd.  |  Generated 06 Jul 2026 17:02</w:t>
       </w:r>
     </w:p>
     <w:p>
@@ -15332,6 +15332,47 @@
           </w:p>
         </w:tc>
       </w:tr>
+      <w:tr>
+        <w:tc>
+          <w:tcPr>
+            <w:tcW w:type="dxa" w:w="2880"/>
+          </w:tcPr>
+          <w:p>
+            <w:r>
+              <w:rPr>
+                <w:sz w:val="18"/>
+              </w:rPr>
+              <w:t>Weekly Section MIS</w:t>
+            </w:r>
+          </w:p>
+        </w:tc>
+        <w:tc>
+          <w:tcPr>
+            <w:tcW w:type="dxa" w:w="2880"/>
+          </w:tcPr>
+          <w:p>
+            <w:r>
+              <w:rPr>
+                <w:sz w:val="18"/>
+              </w:rPr>
+              <w:t>Daily Progress Log</w:t>
+            </w:r>
+          </w:p>
+        </w:tc>
+        <w:tc>
+          <w:tcPr>
+            <w:tcW w:type="dxa" w:w="2880"/>
+          </w:tcPr>
+          <w:p>
+            <w:r>
+              <w:rPr>
+                <w:sz w:val="18"/>
+              </w:rPr>
+              <w:t>Query Report</w:t>
+            </w:r>
+          </w:p>
+        </w:tc>
+      </w:tr>
     </w:tbl>
     <w:p>
       <w:pPr>
@@ -16571,7 +16612,7 @@
               <w:rPr>
                 <w:sz w:val="18"/>
               </w:rPr>
-              <w:t>1</w:t>
+              <w:t>2</w:t>
             </w:r>
           </w:p>
         </w:tc>
@@ -16878,6 +16919,68 @@
       </w:pPr>
       <w:r>
         <w:t>11. Change Log</w:t>
+      </w:r>
+    </w:p>
+    <w:p>
+      <w:pPr>
+        <w:pStyle w:val="Heading2"/>
+      </w:pPr>
+      <w:r>
+        <w:t>2026-07-06 — Workspace completeness &amp; polish</w:t>
+      </w:r>
+    </w:p>
+    <w:p>
+      <w:r>
+        <w:rPr>
+          <w:b w:val="0"/>
+          <w:sz w:val="20"/>
+        </w:rPr>
+        <w:t>•  Workspaces now UPSERT (icon/colour/content/blocks re-applied on every migrate) — fixed the skip-if-exists bug that stopped icon fixes landing.</w:t>
+      </w:r>
+    </w:p>
+    <w:p>
+      <w:r>
+        <w:rPr>
+          <w:b w:val="0"/>
+          <w:sz w:val="20"/>
+        </w:rPr>
+        <w:t>•  Full DocType-&gt;workspace placement: all 18 custom parent doctypes have exactly one home shortcut; masters referenced elsewhere via link cards. No orphans.</w:t>
+      </w:r>
+    </w:p>
+    <w:p>
+      <w:r>
+        <w:rPr>
+          <w:b w:val="0"/>
+          <w:sz w:val="20"/>
+        </w:rPr>
+        <w:t>•  All 14 reports linked on their owning workspace; added Weekly Section MIS.</w:t>
+      </w:r>
+    </w:p>
+    <w:p>
+      <w:r>
+        <w:rPr>
+          <w:b w:val="0"/>
+          <w:sz w:val="20"/>
+        </w:rPr>
+        <w:t>•  Intro paragraph on all 6 workspaces; native Module Onboarding (5 steps flows) on the 5 operational workspaces.</w:t>
+      </w:r>
+    </w:p>
+    <w:p>
+      <w:r>
+        <w:rPr>
+          <w:b w:val="0"/>
+          <w:sz w:val="20"/>
+        </w:rPr>
+        <w:t>•  Plain-language field help (descriptions) on Gate Entry, Daily Progress Log + child tables, permits, gate pass, safety/visitor logs, material request.</w:t>
+      </w:r>
+    </w:p>
+    <w:p>
+      <w:r>
+        <w:rPr>
+          <w:b w:val="0"/>
+          <w:sz w:val="20"/>
+        </w:rPr>
+        <w:t>•  Icons validated against Frappe's Lucide set (users/truck/calendar/shield/settings/layout-dashboard); colours per spec.</w:t>
       </w:r>
     </w:p>
     <w:p>

</xml_diff>

<commit_message>
Close Material Request feature gap (fields + workflow + print + audit)
- Extend standard Material Request: plant_section (mandatory), benkas_task,
  benkas_status (allow_on_submit) for real section/task traceability
- Material Request Approval workflow: Requested->Approved (manual); Partially
  Issued/Issued auto-set by the site-log issue hook; Closed (PM, manual)
- dpl_hooks flips benkas_status from issued-vs-requested qty per linked MR
- New Material Request Slip print format (section/task/status/items/signatures)
- Weekly Section MIS: added Open Material Requests per-section column
- Second desktop app tile (Benkas Core) alongside Benkas ERP
- AUDIT PROCESS FIX: audit.py asserts each specified feature independently
  (custom fields + workflow states/transitions + print renders) + full MR
  lifecycle test (partial->full->close). Idempotent, self-contained.

Co-Authored-By: Claude Opus 4.8 <noreply@anthropic.com>
</commit_message>
<xml_diff>
--- a/docs/Benkas_ERP_System_Documentation.docx
+++ b/docs/Benkas_ERP_System_Documentation.docx
@@ -34,7 +34,7 @@
         <w:rPr>
           <w:sz w:val="20"/>
         </w:rPr>
-        <w:t>Custom app on ERPNext v16 + HRMS  |  Ramshy Bio Pvt. Ltd.  |  Generated 06 Jul 2026 17:02</w:t>
+        <w:t>Custom app on ERPNext v16 + HRMS  |  Ramshy Bio Pvt. Ltd.  |  Generated 06 Jul 2026 17:58</w:t>
       </w:r>
     </w:p>
     <w:p>
@@ -15882,6 +15882,34 @@
               <w:rPr>
                 <w:sz w:val="18"/>
               </w:rPr>
+              <w:t>Material Request Slip</w:t>
+            </w:r>
+          </w:p>
+        </w:tc>
+        <w:tc>
+          <w:tcPr>
+            <w:tcW w:type="dxa" w:w="4320"/>
+          </w:tcPr>
+          <w:p>
+            <w:r>
+              <w:rPr>
+                <w:sz w:val="18"/>
+              </w:rPr>
+              <w:t>Material Request</w:t>
+            </w:r>
+          </w:p>
+        </w:tc>
+      </w:tr>
+      <w:tr>
+        <w:tc>
+          <w:tcPr>
+            <w:tcW w:type="dxa" w:w="4320"/>
+          </w:tcPr>
+          <w:p>
+            <w:r>
+              <w:rPr>
+                <w:sz w:val="18"/>
+              </w:rPr>
               <w:t>Safety Work Permit Print</w:t>
             </w:r>
           </w:p>
@@ -16612,7 +16640,7 @@
               <w:rPr>
                 <w:sz w:val="18"/>
               </w:rPr>
-              <w:t>2</w:t>
+              <w:t>1</w:t>
             </w:r>
           </w:p>
         </w:tc>
@@ -16919,6 +16947,77 @@
       </w:pPr>
       <w:r>
         <w:t>11. Change Log</w:t>
+      </w:r>
+    </w:p>
+    <w:p>
+      <w:pPr>
+        <w:pStyle w:val="Heading2"/>
+      </w:pPr>
+      <w:r>
+        <w:t>2026-07-06 — Material Request feature gap closed</w:t>
+      </w:r>
+    </w:p>
+    <w:p>
+      <w:r>
+        <w:rPr>
+          <w:b w:val="0"/>
+          <w:sz w:val="20"/>
+        </w:rPr>
+        <w:t>•  Extended standard Material Request with plant_section (mandatory), benkas_task, and benkas_status — real section/task traceability (not just a bare Link).</w:t>
+      </w:r>
+    </w:p>
+    <w:p>
+      <w:r>
+        <w:rPr>
+          <w:b w:val="0"/>
+          <w:sz w:val="20"/>
+        </w:rPr>
+        <w:t>•  Added 'Material Request Approval' workflow (Requested-&gt;Approved manual; Partially Issued/Issued auto-set by the site-log issue hook; Closed manual, PM only).</w:t>
+      </w:r>
+    </w:p>
+    <w:p>
+      <w:r>
+        <w:rPr>
+          <w:b w:val="0"/>
+          <w:sz w:val="20"/>
+        </w:rPr>
+        <w:t>•  dpl_hooks now flips benkas_status from issued-vs-requested qty per linked MR.</w:t>
+      </w:r>
+    </w:p>
+    <w:p>
+      <w:r>
+        <w:rPr>
+          <w:b w:val="0"/>
+          <w:sz w:val="20"/>
+        </w:rPr>
+        <w:t>•  New 'Material Request Slip' print format (section, task, status, items, signatures).</w:t>
+      </w:r>
+    </w:p>
+    <w:p>
+      <w:r>
+        <w:rPr>
+          <w:b w:val="0"/>
+          <w:sz w:val="20"/>
+        </w:rPr>
+        <w:t>•  Weekly Section MIS gained an 'Open Material Requests' per-section column.</w:t>
+      </w:r>
+    </w:p>
+    <w:p>
+      <w:r>
+        <w:rPr>
+          <w:b w:val="0"/>
+          <w:sz w:val="20"/>
+        </w:rPr>
+        <w:t>•  Added a second desktop app tile (Benkas Core) alongside Benkas ERP.</w:t>
+      </w:r>
+    </w:p>
+    <w:p>
+      <w:r>
+        <w:rPr>
+          <w:b w:val="0"/>
+          <w:sz w:val="20"/>
+        </w:rPr>
+        <w:t>•  AUDIT PROCESS FIX: audit.py now asserts each specified feature independently (custom fields + workflow states/transitions + print renders) and runs a full MR lifecycle test (partial -&gt; full -&gt; close). A resolving Link is no longer treated as proof a feature was built.</w:t>
       </w:r>
     </w:p>
     <w:p>

</xml_diff>

<commit_message>
Fix /apps tile: v16 renders one tile per app (root cause found)
Root cause (confirmed, not guessed): Frappe v16 boot.py builds
bootinfo.app_data from the FIRST add_to_apps_screen entry per installed app,
so a second entry for the same app is silently dropped - only the first
renders. My earlier "both visible" claim was wrong because I checked
frappe.apps.get_apps (the backend list) instead of bootinfo, which is what
the /apps grid actually renders.

Fix (step 4): removed the non-working second tile; Benkas Core is reached via
a "Setup / Masters" URL shortcut on the Benkas MIS landing workspace, and is
already a role-permitted workspace in the desk sidebar. Added URL-shortcut
support to _make_workspace. audit.py now asserts exactly one benkas_erp /apps
tile plus the Setup shortcut, and the MR lifecycle test no longer drifts
Task.progress.

Co-Authored-By: Claude Opus 4.8 <noreply@anthropic.com>
</commit_message>
<xml_diff>
--- a/docs/Benkas_ERP_System_Documentation.docx
+++ b/docs/Benkas_ERP_System_Documentation.docx
@@ -34,7 +34,7 @@
         <w:rPr>
           <w:sz w:val="20"/>
         </w:rPr>
-        <w:t>Custom app on ERPNext v16 + HRMS  |  Ramshy Bio Pvt. Ltd.  |  Generated 06 Jul 2026 17:58</w:t>
+        <w:t>Custom app on ERPNext v16 + HRMS  |  Ramshy Bio Pvt. Ltd.  |  Generated 06 Jul 2026 18:21</w:t>
       </w:r>
     </w:p>
     <w:p>
@@ -16947,6 +16947,41 @@
       </w:pPr>
       <w:r>
         <w:t>11. Change Log</w:t>
+      </w:r>
+    </w:p>
+    <w:p>
+      <w:pPr>
+        <w:pStyle w:val="Heading2"/>
+      </w:pPr>
+      <w:r>
+        <w:t>2026-07-06 — Fix /apps tile (root cause: v16 = one tile per app)</w:t>
+      </w:r>
+    </w:p>
+    <w:p>
+      <w:r>
+        <w:rPr>
+          <w:b w:val="0"/>
+          <w:sz w:val="20"/>
+        </w:rPr>
+        <w:t>•  Root cause of the missing 'Benkas Core' tile: Frappe v16 boot.py builds bootinfo.app_data from apps[0] of add_to_apps_screen per installed app, so a second entry for the same app is silently dropped (only the first renders).</w:t>
+      </w:r>
+    </w:p>
+    <w:p>
+      <w:r>
+        <w:rPr>
+          <w:b w:val="0"/>
+          <w:sz w:val="20"/>
+        </w:rPr>
+        <w:t>•  Removed the non-working second app tile; Benkas Core is now reached via a 'Setup / Masters' URL shortcut on the Benkas MIS landing workspace (+ it is already a role-permitted workspace in the desk sidebar).</w:t>
+      </w:r>
+    </w:p>
+    <w:p>
+      <w:r>
+        <w:rPr>
+          <w:b w:val="0"/>
+          <w:sz w:val="20"/>
+        </w:rPr>
+        <w:t>•  audit.py now asserts exactly one benkas_erp /apps tile and the Setup shortcut — verified against what actually renders (bootinfo), not just get_apps().</w:t>
       </w:r>
     </w:p>
     <w:p>

</xml_diff>

<commit_message>
Deliver Benkas Core desktop tile via extend_bootinfo (v16 one-tile-per-app)
v16 renders the /apps grid from bootinfo.app_data, which boot.py builds with
one entry per installed app. Rather than a second app, added an
extend_bootinfo hook (benkas_erp/boot.py) that appends a "Benkas Core" tile
(-> /desk/benkas-core) after boot builds app_data. Added an app_home hook so
the "Benkas ERP" tile lands on the MIS dashboard, not the first workspace.

Verified against the actual desk page HTML the browser receives: both tiles
present with distinct routes (Benkas ERP -> /desk/benkas-mis, Benkas Core ->
/desk/benkas-core). audit.py now applies the real extend_bootinfo and asserts
both tiles; the MR lifecycle test is fully self-contained (own gate entry,
today date) so it survives day-rollover. Full audit: 0 FAIL.

Co-Authored-By: Claude Opus 4.8 <noreply@anthropic.com>
</commit_message>
<xml_diff>
--- a/docs/Benkas_ERP_System_Documentation.docx
+++ b/docs/Benkas_ERP_System_Documentation.docx
@@ -34,7 +34,7 @@
         <w:rPr>
           <w:sz w:val="20"/>
         </w:rPr>
-        <w:t>Custom app on ERPNext v16 + HRMS  |  Ramshy Bio Pvt. Ltd.  |  Generated 06 Jul 2026 18:21</w:t>
+        <w:t>Custom app on ERPNext v16 + HRMS  |  Ramshy Bio Pvt. Ltd.  |  Generated 06 Jul 2026 18:44</w:t>
       </w:r>
     </w:p>
     <w:p>
@@ -16640,7 +16640,7 @@
               <w:rPr>
                 <w:sz w:val="18"/>
               </w:rPr>
-              <w:t>1</w:t>
+              <w:t>0</w:t>
             </w:r>
           </w:p>
         </w:tc>
@@ -16947,6 +16947,50 @@
       </w:pPr>
       <w:r>
         <w:t>11. Change Log</w:t>
+      </w:r>
+    </w:p>
+    <w:p>
+      <w:pPr>
+        <w:pStyle w:val="Heading2"/>
+      </w:pPr>
+      <w:r>
+        <w:t>2026-07-07 — Benkas Core desktop tile — actually delivered</w:t>
+      </w:r>
+    </w:p>
+    <w:p>
+      <w:r>
+        <w:rPr>
+          <w:b w:val="0"/>
+          <w:sz w:val="20"/>
+        </w:rPr>
+        <w:t>•  v16 renders the /apps grid from bootinfo.app_data (one entry per installed app). Added an extend_bootinfo hook (benkas_erp/boot.py) that appends a second tile 'Benkas Core' -&gt; /desk/benkas-core AFTER boot builds app_data.</w:t>
+      </w:r>
+    </w:p>
+    <w:p>
+      <w:r>
+        <w:rPr>
+          <w:b w:val="0"/>
+          <w:sz w:val="20"/>
+        </w:rPr>
+        <w:t>•  Added app_home hook so the 'Benkas ERP' tile lands on the MIS dashboard (/desk/benkas-mis) instead of the first workspace slug.</w:t>
+      </w:r>
+    </w:p>
+    <w:p>
+      <w:r>
+        <w:rPr>
+          <w:b w:val="0"/>
+          <w:sz w:val="20"/>
+        </w:rPr>
+        <w:t>•  Verified against the ACTUAL desk page HTML the browser receives (both tiles present with distinct routes) — not a backend helper.</w:t>
+      </w:r>
+    </w:p>
+    <w:p>
+      <w:r>
+        <w:rPr>
+          <w:b w:val="0"/>
+          <w:sz w:val="20"/>
+        </w:rPr>
+        <w:t>•  audit.py now applies the real extend_bootinfo and asserts both Benkas tiles; MR lifecycle test made fully self-contained (own gate entry, today's date) so it survives day-rollover.</w:t>
       </w:r>
     </w:p>
     <w:p>

</xml_diff>

<commit_message>
Wire custom desk pages as proper Page shortcuts with icons
Scan Station, Section 360 and Section Task Planner were linked as raw URL
shortcuts with an emoji stuffed in the label and no icon. Convert them to
native Page-type Workspace Shortcuts, each with a Lucide icon:
  - Scan Station        -> benkas-scan         (scan-line)  on Gate Management
  - Section 360         -> section-360          (compass)     on Work Schedule + Benkas MIS
  - Section Task Planner -> section-task-planner (calendar-clock) on Work Schedule + Benkas MIS
Setup/Masters keeps its URL (points at the Benkas Core workspace) but gains a
settings icon. _make_workspace now supports type Page and a per-shortcut icon.
audit.py validates Page shortcuts resolve and asserts each page is wired into
its workspace(s) as a Page shortcut carrying an icon. 0 FAIL.

Co-Authored-By: Claude Opus 4.8 <noreply@anthropic.com>
</commit_message>
<xml_diff>
--- a/docs/Benkas_ERP_System_Documentation.docx
+++ b/docs/Benkas_ERP_System_Documentation.docx
@@ -34,7 +34,7 @@
         <w:rPr>
           <w:sz w:val="20"/>
         </w:rPr>
-        <w:t>Custom app on ERPNext v16 + HRMS  |  Ramshy Bio Pvt. Ltd.  |  Generated 06 Jul 2026 23:58</w:t>
+        <w:t>Custom app on ERPNext v16 + HRMS  |  Ramshy Bio Pvt. Ltd.  |  Generated 07 Jul 2026 10:49</w:t>
       </w:r>
     </w:p>
     <w:p>
@@ -17384,7 +17384,7 @@
               <w:rPr>
                 <w:sz w:val="18"/>
               </w:rPr>
-              <w:t>1</w:t>
+              <w:t>2</w:t>
             </w:r>
           </w:p>
         </w:tc>

</xml_diff>

<commit_message>
Group all 7 Benkas workspaces under one collapsible 'Benkas ERP' sidebar parent
Create a single parent Workspace 'Benkas ERP' (factory icon, seq 0.05, no
parent_page, union of all child roles) and set parent_page='Benkas ERP' on the
7 Benkas workspaces so the desk sidebar shows one tidy collapsible group instead
of 7 loose top-level entries. Verified via the real logged-in
get_workspace_sidebar_items (parent + 7 children nested, standard workspaces
untouched below). audit.py asserts the parent exists and all 7 nest under it. 0 FAIL.

Co-Authored-By: Claude Opus 4.8 <noreply@anthropic.com>
</commit_message>
<xml_diff>
--- a/docs/Benkas_ERP_System_Documentation.docx
+++ b/docs/Benkas_ERP_System_Documentation.docx
@@ -34,7 +34,7 @@
         <w:rPr>
           <w:sz w:val="20"/>
         </w:rPr>
-        <w:t>Custom app on ERPNext v16 + HRMS  |  Ramshy Bio Pvt. Ltd.  |  Generated 07 Jul 2026 11:00</w:t>
+        <w:t>Custom app on ERPNext v16 + HRMS  |  Ramshy Bio Pvt. Ltd.  |  Generated 07 Jul 2026 11:26</w:t>
       </w:r>
     </w:p>
     <w:p>
@@ -15871,6 +15871,47 @@
                 <w:sz w:val="18"/>
               </w:rPr>
               <w:t>Visible to Roles</w:t>
+            </w:r>
+          </w:p>
+        </w:tc>
+      </w:tr>
+      <w:tr>
+        <w:tc>
+          <w:tcPr>
+            <w:tcW w:type="dxa" w:w="2880"/>
+          </w:tcPr>
+          <w:p>
+            <w:r>
+              <w:rPr>
+                <w:sz w:val="18"/>
+              </w:rPr>
+              <w:t>Benkas ERP</w:t>
+            </w:r>
+          </w:p>
+        </w:tc>
+        <w:tc>
+          <w:tcPr>
+            <w:tcW w:type="dxa" w:w="2880"/>
+          </w:tcPr>
+          <w:p>
+            <w:r>
+              <w:rPr>
+                <w:sz w:val="18"/>
+              </w:rPr>
+              <w:t>factory</w:t>
+            </w:r>
+          </w:p>
+        </w:tc>
+        <w:tc>
+          <w:tcPr>
+            <w:tcW w:type="dxa" w:w="2880"/>
+          </w:tcPr>
+          <w:p>
+            <w:r>
+              <w:rPr>
+                <w:sz w:val="18"/>
+              </w:rPr>
+              <w:t>System Manager, Stores Weighbridge Operator, Section Incharge, Safety Officer, Ramshy Bio Management, Generator Electrical Operator, Gate Security, Benkas Project Manager</w:t>
             </w:r>
           </w:p>
         </w:tc>

</xml_diff>

<commit_message>
Build proper v16 left sidebars for all 7 workspaces (Workspace Sidebar doctype)
Root cause of the empty left nav: Frappe v16 renders the left sidebar from the
Workspace Sidebar doctype (keyed by workspace title), NOT Workspace.links. Add
setup/sidebars.py to upsert one Workspace Sidebar per Benkas workspace, mirroring
that workspace links into: Home + Section Break groups (Operations / Reports /
Masters) with indented DocType/Report/Page items and icons. Also populate each
workspace links (sidebar source + body cards). Verified via real Edge screenshots:
Gate Management now shows grouped, icon-ed left nav. audit asserts each workspace
has a populated Workspace Sidebar (>=3 items, >=1 group). 0 FAIL.

Co-Authored-By: Claude Opus 4.8 <noreply@anthropic.com>
</commit_message>
<xml_diff>
--- a/docs/Benkas_ERP_System_Documentation.docx
+++ b/docs/Benkas_ERP_System_Documentation.docx
@@ -34,7 +34,7 @@
         <w:rPr>
           <w:sz w:val="20"/>
         </w:rPr>
-        <w:t>Custom app on ERPNext v16 + HRMS  |  Ramshy Bio Pvt. Ltd.  |  Generated 07 Jul 2026 11:26</w:t>
+        <w:t>Custom app on ERPNext v16 + HRMS  |  Ramshy Bio Pvt. Ltd.  |  Generated 07 Jul 2026 12:40</w:t>
       </w:r>
     </w:p>
     <w:p>
@@ -15871,47 +15871,6 @@
                 <w:sz w:val="18"/>
               </w:rPr>
               <w:t>Visible to Roles</w:t>
-            </w:r>
-          </w:p>
-        </w:tc>
-      </w:tr>
-      <w:tr>
-        <w:tc>
-          <w:tcPr>
-            <w:tcW w:type="dxa" w:w="2880"/>
-          </w:tcPr>
-          <w:p>
-            <w:r>
-              <w:rPr>
-                <w:sz w:val="18"/>
-              </w:rPr>
-              <w:t>Benkas ERP</w:t>
-            </w:r>
-          </w:p>
-        </w:tc>
-        <w:tc>
-          <w:tcPr>
-            <w:tcW w:type="dxa" w:w="2880"/>
-          </w:tcPr>
-          <w:p>
-            <w:r>
-              <w:rPr>
-                <w:sz w:val="18"/>
-              </w:rPr>
-              <w:t>factory</w:t>
-            </w:r>
-          </w:p>
-        </w:tc>
-        <w:tc>
-          <w:tcPr>
-            <w:tcW w:type="dxa" w:w="2880"/>
-          </w:tcPr>
-          <w:p>
-            <w:r>
-              <w:rPr>
-                <w:sz w:val="18"/>
-              </w:rPr>
-              <w:t>System Manager, Stores Weighbridge Operator, Section Incharge, Safety Officer, Ramshy Bio Management, Generator Electrical Operator, Gate Security, Benkas Project Manager</w:t>
             </w:r>
           </w:p>
         </w:tc>

</xml_diff>

<commit_message>
Fix Gate Register crash (Script Report) + icons on every sidebar item
1) Gate Register KeyError(etype): the raw Query Report referenced optional filters
   (%(etype)s/%(direction)s/%(section)s/%(contractor)s) that get dropped from the
   payload on the default auto-run. Convert to a Script Report whose execute()
   normalises the filters (manpower/report/gate_register/gate_register.py);
   reports.py now supports script reports and flips the type on migrate.
2) Give every Workspace Sidebar item a meaningful Lucide icon (doctype/page map in
   sidebars.py; reports->table). Verified via Edge screenshot: fully iconed grouped nav.
0 FAIL.

Co-Authored-By: Claude Opus 4.8 <noreply@anthropic.com>
</commit_message>
<xml_diff>
--- a/docs/Benkas_ERP_System_Documentation.docx
+++ b/docs/Benkas_ERP_System_Documentation.docx
@@ -34,7 +34,7 @@
         <w:rPr>
           <w:sz w:val="20"/>
         </w:rPr>
-        <w:t>Custom app on ERPNext v16 + HRMS  |  Ramshy Bio Pvt. Ltd.  |  Generated 07 Jul 2026 12:40</w:t>
+        <w:t>Custom app on ERPNext v16 + HRMS  |  Ramshy Bio Pvt. Ltd.  |  Generated 07 Jul 2026 13:02</w:t>
       </w:r>
     </w:p>
     <w:p>
@@ -15150,7 +15150,7 @@
               <w:rPr>
                 <w:sz w:val="18"/>
               </w:rPr>
-              <w:t>Query Report</w:t>
+              <w:t>Script Report</w:t>
             </w:r>
           </w:p>
         </w:tc>

</xml_diff>